<commit_message>
Remove comments and other unnecessary text
</commit_message>
<xml_diff>
--- a/doc/hydromantes_note.docx
+++ b/doc/hydromantes_note.docx
@@ -19,27 +19,14 @@
         <w:t xml:space="preserve"> </w:t>
       </w:r>
       <w:r>
+        <w:t xml:space="preserve">(Mount Lyell Salamander)</w:t>
+      </w:r>
+      <w:r>
         <w:rPr>
           <w:b/>
           <w:bCs/>
         </w:rPr>
-        <w:t xml:space="preserve">(</w:t>
-      </w:r>
-      <w:r>
-        <w:t xml:space="preserve">Mount Lyell Salamander).</w:t>
-      </w:r>
-      <w:r>
-        <w:t xml:space="preserve"> </w:t>
-      </w:r>
-      <w:r>
-        <w:rPr>
-          <w:b/>
-          <w:bCs/>
-        </w:rPr>
-        <w:t xml:space="preserve">LENTIC HABITAT USE</w:t>
-      </w:r>
-      <w:r>
-        <w:t xml:space="preserve">.</w:t>
+        <w:t xml:space="preserve">. LENTIC HABITAT USE.</w:t>
       </w:r>
     </w:p>
     <w:p>
@@ -869,14 +856,6 @@
         <w:pStyle w:val="BodyText"/>
       </w:pPr>
       <w:r>
-        <w:t xml:space="preserve">Possible photos/videos for inclusion: South Lyell: IMG_2468 2.MOV, IMG_2478 2.MOV, IMG_2470.HEIC</w:t>
-      </w:r>
-    </w:p>
-    <w:p>
-      <w:pPr>
-        <w:pStyle w:val="BodyText"/>
-      </w:pPr>
-      <w:r>
         <w:rPr>
           <w:smallCaps/>
         </w:rPr>
@@ -905,10 +884,13 @@
         <w:t xml:space="preserve"> </w:t>
       </w:r>
       <w:r>
-        <w:t xml:space="preserve">along the shoreline of lake 70413 in Yosemite National Park, USA. The lake is visible in the immediate foreground.</w:t>
-      </w:r>
-      <w:r>
-        <w:t xml:space="preserve"> </w:t>
+        <w:t xml:space="preserve">observed along the shoreline of lake 70413 in Yosemite National Park, USA during a nocturnal survey on 19 August 2025.</w:t>
+      </w:r>
+      <w:r>
+        <w:t xml:space="preserve"> </w:t>
+      </w:r>
+      <w:r>
+        <w:t xml:space="preserve">The lake is visible in the immediate foreground.</w:t>
       </w:r>
     </w:p>
     <w:p>

</xml_diff>

<commit_message>
Render to docx format
</commit_message>
<xml_diff>
--- a/doc/hydromantes_note.docx
+++ b/doc/hydromantes_note.docx
@@ -107,26 +107,20 @@
         <w:t xml:space="preserve"> </w:t>
       </w:r>
       <w:r>
-        <w:t xml:space="preserve">Rovito (2010. Mol. Ecol. 19: 4554–4571, Appendix) lists 45 localities from which he collected</w:t>
-      </w:r>
-      <w:r>
-        <w:t xml:space="preserve"> </w:t>
-      </w:r>
-      <w:r>
-        <w:rPr>
-          <w:i/>
-          <w:iCs/>
-        </w:rPr>
-        <w:t xml:space="preserve">H. platycephalus</w:t>
-      </w:r>
-      <w:r>
-        <w:t xml:space="preserve">.</w:t>
-      </w:r>
-      <w:r>
-        <w:t xml:space="preserve"> </w:t>
-      </w:r>
-      <w:r>
-        <w:t xml:space="preserve">Of these, 13 are described as lakes (e.g.,</w:t>
+        <w:t xml:space="preserve">Rovito (2010. Mol. Ecol. 19: 4554–4571, Appendix) lists 45 localities where he collected</w:t>
+      </w:r>
+      <w:r>
+        <w:t xml:space="preserve"> </w:t>
+      </w:r>
+      <w:r>
+        <w:rPr>
+          <w:i/>
+          <w:iCs/>
+        </w:rPr>
+        <w:t xml:space="preserve">H. platycephalus</w:t>
+      </w:r>
+      <w:r>
+        <w:t xml:space="preserve">, 13 of which are described as lakes (e.g.,</w:t>
       </w:r>
       <w:r>
         <w:t xml:space="preserve"> </w:t>
@@ -184,7 +178,7 @@
         <w:t xml:space="preserve"> </w:t>
       </w:r>
       <w:r>
-        <w:t xml:space="preserve">As previously, for most or all of these locality descriptions, it is likely that a lake name was used as a general locator, but that the</w:t>
+        <w:t xml:space="preserve">As in Rovito (2010), for most or all of these locality descriptions, it is likely that a lake name was used as a general locator, but that the</w:t>
       </w:r>
       <w:r>
         <w:t xml:space="preserve"> </w:t>
@@ -201,46 +195,6 @@
       </w:r>
       <w:r>
         <w:t xml:space="preserve">specimens were actually collected from a nearby non-lentic habitat.</w:t>
-      </w:r>
-      <w:r>
-        <w:t xml:space="preserve"> </w:t>
-      </w:r>
-      <w:r>
-        <w:t xml:space="preserve">Here, we provide the first unambiguous description of</w:t>
-      </w:r>
-      <w:r>
-        <w:t xml:space="preserve"> </w:t>
-      </w:r>
-      <w:r>
-        <w:rPr>
-          <w:i/>
-          <w:iCs/>
-        </w:rPr>
-        <w:t xml:space="preserve">H. platycephalus</w:t>
-      </w:r>
-      <w:r>
-        <w:t xml:space="preserve"> </w:t>
-      </w:r>
-      <w:r>
-        <w:t xml:space="preserve">occupying lake habitats in three distinct areas, one each in Sequoia, Kings Canyon, and Yosemite National Parks.</w:t>
-      </w:r>
-      <w:r>
-        <w:t xml:space="preserve"> </w:t>
-      </w:r>
-      <w:r>
-        <w:t xml:space="preserve">The diurnal and nocturnal surveys we employed in all three areas were conducted similarly, with surveyors walking slowly along the lake shore and inlet/outlet streams, searching all habitats encountered, including rock crevices, overhanging banks, and sandy beaches.</w:t>
-      </w:r>
-      <w:r>
-        <w:t xml:space="preserve"> </w:t>
-      </w:r>
-      <w:r>
-        <w:t xml:space="preserve">The surveyed lakes are typical of those found at high elevations in Sierra Nevada, having shorelines composed almost entirely of granite or metavolcanic bedrock and boulder, interspersed with short stretches of sandy beach or overhanging banks covered with meadow vegetation.</w:t>
-      </w:r>
-      <w:r>
-        <w:t xml:space="preserve"> </w:t>
-      </w:r>
-      <w:r>
-        <w:t xml:space="preserve">All lakes included in this study are located west of the Sierra Nevada crest.</w:t>
       </w:r>
     </w:p>
     <w:p>
@@ -248,245 +202,41 @@
         <w:pStyle w:val="BodyText"/>
       </w:pPr>
       <w:r>
-        <w:t xml:space="preserve">In Sequoia National Park, on 06 Aug 2011 (2030-2130 h), RK searched for</w:t>
-      </w:r>
-      <w:r>
-        <w:t xml:space="preserve"> </w:t>
-      </w:r>
-      <w:r>
-        <w:rPr>
-          <w:i/>
-          <w:iCs/>
-        </w:rPr>
-        <w:t xml:space="preserve">H. platycephalus</w:t>
-      </w:r>
-      <w:r>
-        <w:t xml:space="preserve"> </w:t>
-      </w:r>
-      <w:r>
-        <w:t xml:space="preserve">in seeps flowing over granite outcrops above and approximately 300 m west of an unnamed lake (lake id = 20279; 36.3582°N, -118.4711°W, WGS 84, 3315 m elev.) located in the headwaters of Coyote Creek.</w:t>
-      </w:r>
-      <w:r>
-        <w:t xml:space="preserve"> </w:t>
-      </w:r>
-      <w:r>
-        <w:t xml:space="preserve">On 07 Aug 2011 (approximately 2100 h), RK searched similar habitat above and approximately 300 m west of an unnamed lake (site id = 20276; 36.3669°N, -118.4883°W, WGS 84, 3298 m elev.) located in the headwaters of Laurel Creek.</w:t>
-      </w:r>
-      <w:r>
-        <w:t xml:space="preserve"> </w:t>
-      </w:r>
-      <w:r>
-        <w:t xml:space="preserve">Coyote and Laurel Creeks are tributaries of the Kern River.</w:t>
-      </w:r>
-      <w:r>
-        <w:t xml:space="preserve"> </w:t>
-      </w:r>
-      <w:r>
-        <w:t xml:space="preserve">Despite the searched sites being 8.1 km and 6.5 km, respectively, southeast of the southernmost known</w:t>
-      </w:r>
-      <w:r>
-        <w:t xml:space="preserve"> </w:t>
-      </w:r>
-      <w:r>
-        <w:rPr>
-          <w:i/>
-          <w:iCs/>
-        </w:rPr>
-        <w:t xml:space="preserve">H. platycephalus</w:t>
-      </w:r>
-      <w:r>
-        <w:t xml:space="preserve"> </w:t>
-      </w:r>
-      <w:r>
-        <w:t xml:space="preserve">locality west of the Sierra Nevada crest (Wake and Papenfuss 2005), 5–10</w:t>
-      </w:r>
-      <w:r>
-        <w:t xml:space="preserve"> </w:t>
-      </w:r>
-      <w:r>
-        <w:rPr>
-          <w:i/>
-          <w:iCs/>
-        </w:rPr>
-        <w:t xml:space="preserve">H. platycephalus</w:t>
-      </w:r>
-      <w:r>
-        <w:t xml:space="preserve"> </w:t>
-      </w:r>
-      <w:r>
-        <w:t xml:space="preserve">were found at each location.</w:t>
-      </w:r>
-      <w:r>
-        <w:t xml:space="preserve"> </w:t>
-      </w:r>
-      <w:r>
-        <w:t xml:space="preserve">The Laurel Creek area was surveyed again in 2024 (by FP and RK) and 2025 (by CS and RK), with a focus on lake 20276.</w:t>
-      </w:r>
-      <w:r>
-        <w:t xml:space="preserve"> </w:t>
-      </w:r>
-      <w:r>
-        <w:t xml:space="preserve">20276 has a surface area of 1.7 ha and a maximum depth of 12.5 m.</w:t>
-      </w:r>
-      <w:r>
-        <w:t xml:space="preserve"> </w:t>
-      </w:r>
-      <w:r>
-        <w:t xml:space="preserve">During 14–16 July 2024, we conducted one diurnal survey (0910-1210 h) and two nocturnal surveys (2130–2315 h) of the entire shoreline and associated inlet and outlet streams of 20276, and one nocturnal survey of the original bedrock outcrop locality (approximately 2200 h).</w:t>
-      </w:r>
-      <w:r>
-        <w:t xml:space="preserve"> </w:t>
-      </w:r>
-      <w:r>
-        <w:t xml:space="preserve">During the diurnal survey of 20276, no</w:t>
-      </w:r>
-      <w:r>
-        <w:t xml:space="preserve"> </w:t>
-      </w:r>
-      <w:r>
-        <w:rPr>
-          <w:i/>
-          <w:iCs/>
-        </w:rPr>
-        <w:t xml:space="preserve">H. platycephalus</w:t>
-      </w:r>
-      <w:r>
-        <w:t xml:space="preserve"> </w:t>
-      </w:r>
-      <w:r>
-        <w:t xml:space="preserve">were found.</w:t>
-      </w:r>
-      <w:r>
-        <w:t xml:space="preserve"> </w:t>
-      </w:r>
-      <w:r>
-        <w:t xml:space="preserve">During the two nocturnal surveys of 20276, we observed a total of 9</w:t>
-      </w:r>
-      <w:r>
-        <w:t xml:space="preserve"> </w:t>
-      </w:r>
-      <w:r>
-        <w:rPr>
-          <w:i/>
-          <w:iCs/>
-        </w:rPr>
-        <w:t xml:space="preserve">H. platycephalus</w:t>
-      </w:r>
-      <w:r>
-        <w:t xml:space="preserve"> </w:t>
-      </w:r>
-      <w:r>
-        <w:t xml:space="preserve">(2 on 15 July, 7 on 16 July), all on the northeast shore.</w:t>
-      </w:r>
-      <w:r>
-        <w:t xml:space="preserve"> </w:t>
-      </w:r>
-      <w:r>
-        <w:t xml:space="preserve">We found no</w:t>
-      </w:r>
-      <w:r>
-        <w:t xml:space="preserve"> </w:t>
-      </w:r>
-      <w:r>
-        <w:rPr>
-          <w:i/>
-          <w:iCs/>
-        </w:rPr>
-        <w:t xml:space="preserve">H. platycephalus</w:t>
-      </w:r>
-      <w:r>
-        <w:t xml:space="preserve"> </w:t>
-      </w:r>
-      <w:r>
-        <w:t xml:space="preserve">during the nocturnal survey at the original outcrop locality.</w:t>
-      </w:r>
-      <w:r>
-        <w:t xml:space="preserve"> </w:t>
-      </w:r>
-      <w:r>
-        <w:t xml:space="preserve">In 2025, we repeated this survey, conducting one diurnal survey (12 July, 0900–1110 h) and two nocturnal surveys of the entire shoreline of 20276 (12 July, 2130–2345 h; 13 July, 2140–2310 h), and one nocturnal survey of the original outcrop locality (13 July, approximately 2330 h)</w:t>
-      </w:r>
-      <w:r>
-        <w:t xml:space="preserve">.</w:t>
-      </w:r>
-      <w:r>
-        <w:t xml:space="preserve"> </w:t>
-      </w:r>
-      <w:r>
-        <w:t xml:space="preserve">Again, we found no</w:t>
-      </w:r>
-      <w:r>
-        <w:t xml:space="preserve"> </w:t>
-      </w:r>
-      <w:r>
-        <w:rPr>
-          <w:i/>
-          <w:iCs/>
-        </w:rPr>
-        <w:t xml:space="preserve">H. platycephalus</w:t>
-      </w:r>
-      <w:r>
-        <w:t xml:space="preserve"> </w:t>
-      </w:r>
-      <w:r>
-        <w:t xml:space="preserve">during the diurnal survey of 20276 or the nocturnal survey of the original outcrop locality.</w:t>
-      </w:r>
-      <w:r>
-        <w:t xml:space="preserve"> </w:t>
-      </w:r>
-      <w:r>
-        <w:t xml:space="preserve">However, we saw 20-30</w:t>
-      </w:r>
-      <w:r>
-        <w:t xml:space="preserve"> </w:t>
-      </w:r>
-      <w:r>
-        <w:rPr>
-          <w:i/>
-          <w:iCs/>
-        </w:rPr>
-        <w:t xml:space="preserve">H. platycephalus</w:t>
-      </w:r>
-      <w:r>
-        <w:t xml:space="preserve"> </w:t>
-      </w:r>
-      <w:r>
-        <w:t xml:space="preserve">during each of the two nocturnal surveys of 20276.</w:t>
-      </w:r>
-      <w:r>
-        <w:t xml:space="preserve"> </w:t>
-      </w:r>
-      <w:r>
-        <w:t xml:space="preserve">In both years,</w:t>
-      </w:r>
-      <w:r>
-        <w:t xml:space="preserve"> </w:t>
-      </w:r>
-      <w:r>
-        <w:rPr>
-          <w:i/>
-          <w:iCs/>
-        </w:rPr>
-        <w:t xml:space="preserve">H</w:t>
-      </w:r>
-      <w:r>
-        <w:t xml:space="preserve">.</w:t>
-      </w:r>
-      <w:r>
-        <w:t xml:space="preserve"> </w:t>
-      </w:r>
-      <w:r>
-        <w:rPr>
-          <w:i/>
-          <w:iCs/>
-        </w:rPr>
-        <w:t xml:space="preserve">platycephalus</w:t>
-      </w:r>
-      <w:r>
-        <w:t xml:space="preserve"> </w:t>
-      </w:r>
-      <w:r>
-        <w:t xml:space="preserve">were concentrated on the southeast and northeast shorelines, and were observed on wet rocks and moss on the shore within 0–1 m of the lake.</w:t>
+        <w:t xml:space="preserve">Here, we provide the first unambiguous description of</w:t>
+      </w:r>
+      <w:r>
+        <w:t xml:space="preserve"> </w:t>
+      </w:r>
+      <w:r>
+        <w:rPr>
+          <w:i/>
+          <w:iCs/>
+        </w:rPr>
+        <w:t xml:space="preserve">H. platycephalus</w:t>
+      </w:r>
+      <w:r>
+        <w:t xml:space="preserve"> </w:t>
+      </w:r>
+      <w:r>
+        <w:t xml:space="preserve">occupying lake habitats in three distinct areas of the Sierra Nevada, one each in Yosemite, Kings Canyon, and Sequoia National Parks.</w:t>
+      </w:r>
+      <w:r>
+        <w:t xml:space="preserve"> </w:t>
+      </w:r>
+      <w:r>
+        <w:t xml:space="preserve">The diurnal and nocturnal surveys we employed in all three areas were conducted similarly, with surveyors walking slowly along the lake shore and inlet/outlet streams, and searching all habitats encountered, including rock crevices, overhanging banks, and sandy beaches.</w:t>
+      </w:r>
+      <w:r>
+        <w:t xml:space="preserve"> </w:t>
+      </w:r>
+      <w:r>
+        <w:t xml:space="preserve">The surveyed lakes are typical of those found at high elevations in Sierra Nevada, having shorelines composed almost entirely of granite or metavolcanic bedrock and boulder, interspersed with short stretches of sandy beach or overhanging banks covered with meadow vegetation.</w:t>
+      </w:r>
+      <w:r>
+        <w:t xml:space="preserve"> </w:t>
+      </w:r>
+      <w:r>
+        <w:t xml:space="preserve">All lakes included in this study are located west of the Sierra Nevada crest.</w:t>
       </w:r>
     </w:p>
     <w:p>
@@ -494,79 +244,216 @@
         <w:pStyle w:val="BodyText"/>
       </w:pPr>
       <w:r>
-        <w:t xml:space="preserve">On 08–09 August 2025, PL and GL surveyed an unnamed lake west of Mount Goddard in Kings Canyon National Park (site id = 10114; 37.1019°N, -118.737°W, WGS 84, 3409 m elev.).</w:t>
-      </w:r>
-      <w:r>
-        <w:t xml:space="preserve"> </w:t>
-      </w:r>
-      <w:r>
-        <w:t xml:space="preserve">This lake is at the headwaters of the South Fork San Joaquin River, and has a surface area of 6.6 ha and a maximum depth of 28.5 m.</w:t>
-      </w:r>
-      <w:r>
-        <w:t xml:space="preserve"> </w:t>
-      </w:r>
-      <w:r>
-        <w:t xml:space="preserve">During diurnal surveys of 10114 conducted on 08 August and 09 August (1140–1710 h and 1050–1320 h, respectively) of the entire lake shoreline and associated inlets and outlets, we found a total of 7</w:t>
-      </w:r>
-      <w:r>
-        <w:t xml:space="preserve"> </w:t>
-      </w:r>
-      <w:r>
-        <w:rPr>
-          <w:i/>
-          <w:iCs/>
-        </w:rPr>
-        <w:t xml:space="preserve">H. platycephalus</w:t>
-      </w:r>
-      <w:r>
-        <w:t xml:space="preserve"> </w:t>
-      </w:r>
-      <w:r>
-        <w:t xml:space="preserve">20–50 m up the northeastern inlet (5 on 08 August, 2 on 09 August).</w:t>
-      </w:r>
-      <w:r>
-        <w:t xml:space="preserve"> </w:t>
-      </w:r>
-      <w:r>
-        <w:t xml:space="preserve">During a nocturnal survey on 08 August (2120–2330 h) of the entire lake shoreline and northeastern inlet, we observed two</w:t>
-      </w:r>
-      <w:r>
-        <w:t xml:space="preserve"> </w:t>
-      </w:r>
-      <w:r>
-        <w:rPr>
-          <w:i/>
-          <w:iCs/>
-        </w:rPr>
-        <w:t xml:space="preserve">H. platycephalus</w:t>
-      </w:r>
-      <w:r>
-        <w:t xml:space="preserve"> </w:t>
-      </w:r>
-      <w:r>
-        <w:t xml:space="preserve">in the northeastern inlet and three on the lake shoreline.</w:t>
-      </w:r>
-      <w:r>
-        <w:t xml:space="preserve"> </w:t>
-      </w:r>
-      <w:r>
-        <w:t xml:space="preserve">Of the three</w:t>
-      </w:r>
-      <w:r>
-        <w:t xml:space="preserve"> </w:t>
-      </w:r>
-      <w:r>
-        <w:rPr>
-          <w:i/>
-          <w:iCs/>
-        </w:rPr>
-        <w:t xml:space="preserve">H. platycephalus</w:t>
-      </w:r>
-      <w:r>
-        <w:t xml:space="preserve"> </w:t>
-      </w:r>
-      <w:r>
-        <w:t xml:space="preserve">found along the shoreline, two were under an overhanging grassy bank within 0–1 m of the lake and one was approximately 5 m from the lake shore on a dry, vegetated slope.</w:t>
+        <w:t xml:space="preserve">In Yosemite National Park, on 22–23 July 2024, PL and GL surveyed an unnamed lake (lake ID = 70413; 37.7197°N, -119.2805°W, WGS 84, 3322 m elev.) for</w:t>
+      </w:r>
+      <w:r>
+        <w:t xml:space="preserve"> </w:t>
+      </w:r>
+      <w:r>
+        <w:rPr>
+          <w:i/>
+          <w:iCs/>
+        </w:rPr>
+        <w:t xml:space="preserve">H. platycephalus</w:t>
+      </w:r>
+      <w:r>
+        <w:t xml:space="preserve">.</w:t>
+      </w:r>
+      <w:r>
+        <w:t xml:space="preserve"> </w:t>
+      </w:r>
+      <w:r>
+        <w:t xml:space="preserve">This lake is located in the headwaters of the Lyell Fork of the Merced River, and has a surface area of 2.3 ha and a maximum depth of 10.5 m.</w:t>
+      </w:r>
+      <w:r>
+        <w:t xml:space="preserve"> </w:t>
+      </w:r>
+      <w:r>
+        <w:t xml:space="preserve">On 22 July, PL and GL conducted a nocturnal survey (2130–2245 h) of 70413, including the talus habitat above the lake, and the northern inlet and northwestern shoreline of the lake itself.</w:t>
+      </w:r>
+      <w:r>
+        <w:t xml:space="preserve"> </w:t>
+      </w:r>
+      <w:r>
+        <w:t xml:space="preserve">In the first 150 m of the inlet, we observed 11 adult</w:t>
+      </w:r>
+      <w:r>
+        <w:t xml:space="preserve"> </w:t>
+      </w:r>
+      <w:r>
+        <w:rPr>
+          <w:i/>
+          <w:iCs/>
+        </w:rPr>
+        <w:t xml:space="preserve">H. platycephalus</w:t>
+      </w:r>
+      <w:r>
+        <w:t xml:space="preserve"> </w:t>
+      </w:r>
+      <w:r>
+        <w:t xml:space="preserve">in bedrock, talus, moss, and meadow habitats bordering the creek.</w:t>
+      </w:r>
+      <w:r>
+        <w:t xml:space="preserve"> </w:t>
+      </w:r>
+      <w:r>
+        <w:t xml:space="preserve">No individuals were observed in the talus habitat above the lake or along the northwestern lake shore.</w:t>
+      </w:r>
+      <w:r>
+        <w:t xml:space="preserve"> </w:t>
+      </w:r>
+      <w:r>
+        <w:t xml:space="preserve">On 23 July, PL conducted a nocturnal survey of the entire shoreline of 70413 and associated inlet and outlet streams (2150-0200 h).</w:t>
+      </w:r>
+      <w:r>
+        <w:t xml:space="preserve"> </w:t>
+      </w:r>
+      <w:r>
+        <w:t xml:space="preserve">No</w:t>
+      </w:r>
+      <w:r>
+        <w:t xml:space="preserve"> </w:t>
+      </w:r>
+      <w:r>
+        <w:rPr>
+          <w:i/>
+          <w:iCs/>
+        </w:rPr>
+        <w:t xml:space="preserve">H. platycephalus</w:t>
+      </w:r>
+      <w:r>
+        <w:t xml:space="preserve"> </w:t>
+      </w:r>
+      <w:r>
+        <w:t xml:space="preserve">were observed along the northern inlet where they were seen the previous night.</w:t>
+      </w:r>
+      <w:r>
+        <w:t xml:space="preserve"> </w:t>
+      </w:r>
+      <w:r>
+        <w:t xml:space="preserve">However, a single salamander was observed on the northern shoreline, on a vegetated bank within 1 m of the lake.</w:t>
+      </w:r>
+      <w:r>
+        <w:t xml:space="preserve"> </w:t>
+      </w:r>
+      <w:r>
+        <w:t xml:space="preserve">On 18–19 August 2025, PL, GL, and LW again searched 70413 for</w:t>
+      </w:r>
+      <w:r>
+        <w:t xml:space="preserve"> </w:t>
+      </w:r>
+      <w:r>
+        <w:rPr>
+          <w:i/>
+          <w:iCs/>
+        </w:rPr>
+        <w:t xml:space="preserve">H. platycephalus</w:t>
+      </w:r>
+      <w:r>
+        <w:t xml:space="preserve">.</w:t>
+      </w:r>
+      <w:r>
+        <w:t xml:space="preserve"> </w:t>
+      </w:r>
+      <w:r>
+        <w:t xml:space="preserve">On 18 August, during a diurnal survey of the lake shore and associated inlet and outlet streams (1250–1750), no</w:t>
+      </w:r>
+      <w:r>
+        <w:t xml:space="preserve"> </w:t>
+      </w:r>
+      <w:r>
+        <w:rPr>
+          <w:i/>
+          <w:iCs/>
+        </w:rPr>
+        <w:t xml:space="preserve">H. platycephalus</w:t>
+      </w:r>
+      <w:r>
+        <w:t xml:space="preserve"> </w:t>
+      </w:r>
+      <w:r>
+        <w:t xml:space="preserve">were seen.</w:t>
+      </w:r>
+      <w:r>
+        <w:t xml:space="preserve"> </w:t>
+      </w:r>
+      <w:r>
+        <w:t xml:space="preserve">On 19 August, we conducted a nocturnal survey (2100-2230 h) of the northern inlet and the northern lake shore.</w:t>
+      </w:r>
+      <w:r>
+        <w:t xml:space="preserve"> </w:t>
+      </w:r>
+      <w:r>
+        <w:t xml:space="preserve">Two</w:t>
+      </w:r>
+      <w:r>
+        <w:t xml:space="preserve"> </w:t>
+      </w:r>
+      <w:r>
+        <w:rPr>
+          <w:i/>
+          <w:iCs/>
+        </w:rPr>
+        <w:t xml:space="preserve">H. platycephalus</w:t>
+      </w:r>
+      <w:r>
+        <w:t xml:space="preserve"> </w:t>
+      </w:r>
+      <w:r>
+        <w:t xml:space="preserve">were observed in the first 100 m of the inlet.</w:t>
+      </w:r>
+      <w:r>
+        <w:t xml:space="preserve"> </w:t>
+      </w:r>
+      <w:r>
+        <w:t xml:space="preserve">On the northern lake shore, we found &gt; 60</w:t>
+      </w:r>
+      <w:r>
+        <w:t xml:space="preserve"> </w:t>
+      </w:r>
+      <w:r>
+        <w:rPr>
+          <w:i/>
+          <w:iCs/>
+        </w:rPr>
+        <w:t xml:space="preserve">H. platycephalus</w:t>
+      </w:r>
+      <w:r>
+        <w:t xml:space="preserve"> </w:t>
+      </w:r>
+      <w:r>
+        <w:t xml:space="preserve">(Fig. 1).</w:t>
+      </w:r>
+      <w:r>
+        <w:t xml:space="preserve"> </w:t>
+      </w:r>
+      <w:r>
+        <w:t xml:space="preserve">Nearly all were observed on moss, in meadow vegetation, or at the base of a grassy bank along a sandy beach, and within 0–0.5 m of the lake.</w:t>
+      </w:r>
+      <w:r>
+        <w:t xml:space="preserve"> </w:t>
+      </w:r>
+      <w:r>
+        <w:t xml:space="preserve">Notably, of these approximately 60</w:t>
+      </w:r>
+      <w:r>
+        <w:t xml:space="preserve"> </w:t>
+      </w:r>
+      <w:r>
+        <w:rPr>
+          <w:i/>
+          <w:iCs/>
+        </w:rPr>
+        <w:t xml:space="preserve">H. platycephalus</w:t>
+      </w:r>
+      <w:r>
+        <w:t xml:space="preserve">, three individuals were found submerged in nearshore portions of the lake.</w:t>
+      </w:r>
+      <w:r>
+        <w:t xml:space="preserve"> </w:t>
+      </w:r>
+      <w:r>
+        <w:t xml:space="preserve">All three salamanders were alive, as evidenced by their movement when in the beam of a headlamp.</w:t>
       </w:r>
     </w:p>
     <w:p>
@@ -574,219 +461,79 @@
         <w:pStyle w:val="BodyText"/>
       </w:pPr>
       <w:r>
-        <w:t xml:space="preserve">On 22–23 July 2024, PL and GL surveyed an unnamed lake (lake ID = 70413; 37.7197°N, -119.2805°W, WGS 84, 3322 m elev.) in Yosemite National Park for</w:t>
-      </w:r>
-      <w:r>
-        <w:t xml:space="preserve"> </w:t>
-      </w:r>
-      <w:r>
-        <w:rPr>
-          <w:i/>
-          <w:iCs/>
-        </w:rPr>
-        <w:t xml:space="preserve">H. platycephalus</w:t>
-      </w:r>
-      <w:r>
-        <w:t xml:space="preserve">.</w:t>
-      </w:r>
-      <w:r>
-        <w:t xml:space="preserve"> </w:t>
-      </w:r>
-      <w:r>
-        <w:t xml:space="preserve">This lake is located in the headwaters of the Lyell Fork of the Merced River, and has a surface area of 2.3 ha and a maximum depth of 10.5 m.</w:t>
-      </w:r>
-      <w:r>
-        <w:t xml:space="preserve"> </w:t>
-      </w:r>
-      <w:r>
-        <w:t xml:space="preserve">On 22 July, PL and GL conducted a nocturnal survey (2130–2245 h) of 70413, including the granite talus habitat above the lake, and the northern inlet and northwestern shoreline of the lake itself.</w:t>
-      </w:r>
-      <w:r>
-        <w:t xml:space="preserve"> </w:t>
-      </w:r>
-      <w:r>
-        <w:t xml:space="preserve">In the first 150 m of the inlet, we observed 11 adult</w:t>
-      </w:r>
-      <w:r>
-        <w:t xml:space="preserve"> </w:t>
-      </w:r>
-      <w:r>
-        <w:rPr>
-          <w:i/>
-          <w:iCs/>
-        </w:rPr>
-        <w:t xml:space="preserve">H. platycephalus</w:t>
-      </w:r>
-      <w:r>
-        <w:t xml:space="preserve"> </w:t>
-      </w:r>
-      <w:r>
-        <w:t xml:space="preserve">in bedrock, talus, moss, and meadow habitats bordering the creek.</w:t>
-      </w:r>
-      <w:r>
-        <w:t xml:space="preserve"> </w:t>
-      </w:r>
-      <w:r>
-        <w:t xml:space="preserve">No individuals were observed in the talus habitat above the lake or along the northwestern lake shore.</w:t>
-      </w:r>
-      <w:r>
-        <w:t xml:space="preserve"> </w:t>
-      </w:r>
-      <w:r>
-        <w:t xml:space="preserve">On 23 July, PL conducted a nocturnal survey of the entire shoreline of 70413 and associated inlet and outlet streams (2150-0200 h).</w:t>
-      </w:r>
-      <w:r>
-        <w:t xml:space="preserve"> </w:t>
-      </w:r>
-      <w:r>
-        <w:t xml:space="preserve">No</w:t>
-      </w:r>
-      <w:r>
-        <w:t xml:space="preserve"> </w:t>
-      </w:r>
-      <w:r>
-        <w:rPr>
-          <w:i/>
-          <w:iCs/>
-        </w:rPr>
-        <w:t xml:space="preserve">H. platycephalus</w:t>
-      </w:r>
-      <w:r>
-        <w:t xml:space="preserve"> </w:t>
-      </w:r>
-      <w:r>
-        <w:t xml:space="preserve">were observed along the northern inlet where they were seen the previous night.</w:t>
-      </w:r>
-      <w:r>
-        <w:t xml:space="preserve"> </w:t>
-      </w:r>
-      <w:r>
-        <w:t xml:space="preserve">However, a single salamander was observed on the northern shoreline, on a vegetated bank within 1 m of the lake.</w:t>
-      </w:r>
-      <w:r>
-        <w:t xml:space="preserve"> </w:t>
-      </w:r>
-      <w:r>
-        <w:t xml:space="preserve">On 18–19 August 2025, PL, GL, and LW again searched 70413 for</w:t>
-      </w:r>
-      <w:r>
-        <w:t xml:space="preserve"> </w:t>
-      </w:r>
-      <w:r>
-        <w:rPr>
-          <w:i/>
-          <w:iCs/>
-        </w:rPr>
-        <w:t xml:space="preserve">H. platycephalus</w:t>
-      </w:r>
-      <w:r>
-        <w:t xml:space="preserve">.</w:t>
-      </w:r>
-      <w:r>
-        <w:t xml:space="preserve"> </w:t>
-      </w:r>
-      <w:r>
-        <w:t xml:space="preserve">On 18 August, during a diurnal survey of the lake shore and associated inlet and outlet streams (1250–1750), no</w:t>
-      </w:r>
-      <w:r>
-        <w:t xml:space="preserve"> </w:t>
-      </w:r>
-      <w:r>
-        <w:rPr>
-          <w:i/>
-          <w:iCs/>
-        </w:rPr>
-        <w:t xml:space="preserve">H. platycephalus</w:t>
-      </w:r>
-      <w:r>
-        <w:t xml:space="preserve"> </w:t>
-      </w:r>
-      <w:r>
-        <w:t xml:space="preserve">were seen.</w:t>
-      </w:r>
-      <w:r>
-        <w:t xml:space="preserve"> </w:t>
-      </w:r>
-      <w:r>
-        <w:t xml:space="preserve">On 19 August, we conducted a nocturnal survey (2100-2230 h) of the northern inlet and the northern lake shore.</w:t>
-      </w:r>
-      <w:r>
-        <w:t xml:space="preserve"> </w:t>
-      </w:r>
-      <w:r>
-        <w:t xml:space="preserve">Two</w:t>
-      </w:r>
-      <w:r>
-        <w:t xml:space="preserve"> </w:t>
-      </w:r>
-      <w:r>
-        <w:rPr>
-          <w:i/>
-          <w:iCs/>
-        </w:rPr>
-        <w:t xml:space="preserve">H. platycephalus</w:t>
-      </w:r>
-      <w:r>
-        <w:t xml:space="preserve"> </w:t>
-      </w:r>
-      <w:r>
-        <w:t xml:space="preserve">were observed in the first 100 m of the inlet.</w:t>
-      </w:r>
-      <w:r>
-        <w:t xml:space="preserve"> </w:t>
-      </w:r>
-      <w:r>
-        <w:t xml:space="preserve">On the northern lake shore, we found &gt; 60</w:t>
-      </w:r>
-      <w:r>
-        <w:t xml:space="preserve"> </w:t>
-      </w:r>
-      <w:r>
-        <w:rPr>
-          <w:i/>
-          <w:iCs/>
-        </w:rPr>
-        <w:t xml:space="preserve">H. platycephalus</w:t>
-      </w:r>
-      <w:r>
-        <w:t xml:space="preserve"> </w:t>
-      </w:r>
-      <w:r>
-        <w:t xml:space="preserve">(Fig. 1).</w:t>
-      </w:r>
-      <w:r>
-        <w:t xml:space="preserve"> </w:t>
-      </w:r>
-      <w:r>
-        <w:t xml:space="preserve">Nearly all were observed on moss, in meadow vegetation, or at the base of a grassy bank along a sandy beach, and within 0–0.5 m of the lake.</w:t>
-      </w:r>
-      <w:r>
-        <w:t xml:space="preserve"> </w:t>
-      </w:r>
-      <w:r>
-        <w:t xml:space="preserve">Notably, of these approximately 60</w:t>
-      </w:r>
-      <w:r>
-        <w:t xml:space="preserve"> </w:t>
-      </w:r>
-      <w:r>
-        <w:rPr>
-          <w:i/>
-          <w:iCs/>
-        </w:rPr>
-        <w:t xml:space="preserve">H. platycephalus</w:t>
-      </w:r>
-      <w:r>
-        <w:t xml:space="preserve">, three individuals were submerged in shallow water at the shoreline.</w:t>
-      </w:r>
-      <w:r>
-        <w:t xml:space="preserve"> </w:t>
-      </w:r>
-      <w:r>
-        <w:t xml:space="preserve">All three salamanders were alive, as evidenced by their movement when in the beam of a headlamp.</w:t>
-      </w:r>
-      <w:r>
-        <w:t xml:space="preserve"> </w:t>
+        <w:t xml:space="preserve">In Kings Canyon National Park, on 08–09 August 2025, PL and GL surveyed an unnamed lake west of Mount Goddard (site id = 10114; 37.1019°N, -118.7370°W, WGS 84, 3409 m elev.).</w:t>
+      </w:r>
+      <w:r>
+        <w:t xml:space="preserve"> </w:t>
+      </w:r>
+      <w:r>
+        <w:t xml:space="preserve">This lake is at the headwaters of the South Fork San Joaquin River, and has a surface area of 6.6 ha and a maximum depth of 28.5 m.</w:t>
+      </w:r>
+      <w:r>
+        <w:t xml:space="preserve"> </w:t>
+      </w:r>
+      <w:r>
+        <w:t xml:space="preserve">During diurnal surveys of 10114 conducted on 08 August and 09 August (1140–1710 h and 1050–1320 h, respectively) of the entire lake shoreline and associated inlets and outlets, we found a total of 7</w:t>
+      </w:r>
+      <w:r>
+        <w:t xml:space="preserve"> </w:t>
+      </w:r>
+      <w:r>
+        <w:rPr>
+          <w:i/>
+          <w:iCs/>
+        </w:rPr>
+        <w:t xml:space="preserve">H. platycephalus</w:t>
+      </w:r>
+      <w:r>
+        <w:t xml:space="preserve"> </w:t>
+      </w:r>
+      <w:r>
+        <w:t xml:space="preserve">20–50 m up the northeastern inlet (5 on 08 August, 2 on 09 August).</w:t>
+      </w:r>
+      <w:r>
+        <w:t xml:space="preserve"> </w:t>
+      </w:r>
+      <w:r>
+        <w:t xml:space="preserve">During a nocturnal survey on 08 August (2120–2330 h) of the entire lake shoreline and northeastern inlet, we observed two</w:t>
+      </w:r>
+      <w:r>
+        <w:t xml:space="preserve"> </w:t>
+      </w:r>
+      <w:r>
+        <w:rPr>
+          <w:i/>
+          <w:iCs/>
+        </w:rPr>
+        <w:t xml:space="preserve">H. platycephalus</w:t>
+      </w:r>
+      <w:r>
+        <w:t xml:space="preserve"> </w:t>
+      </w:r>
+      <w:r>
+        <w:t xml:space="preserve">in the northeastern inlet and three on the lake shoreline.</w:t>
+      </w:r>
+      <w:r>
+        <w:t xml:space="preserve"> </w:t>
+      </w:r>
+      <w:r>
+        <w:t xml:space="preserve">Of the three</w:t>
+      </w:r>
+      <w:r>
+        <w:t xml:space="preserve"> </w:t>
+      </w:r>
+      <w:r>
+        <w:rPr>
+          <w:i/>
+          <w:iCs/>
+        </w:rPr>
+        <w:t xml:space="preserve">H. platycephalus</w:t>
+      </w:r>
+      <w:r>
+        <w:t xml:space="preserve"> </w:t>
+      </w:r>
+      <w:r>
+        <w:t xml:space="preserve">found along the shoreline, two were under an overhanging grassy bank within 0–1 m of the lake and one was approximately 5 m from the lake shore on a dry, vegetated slope.</w:t>
       </w:r>
     </w:p>
     <w:p>
@@ -794,61 +541,245 @@
         <w:pStyle w:val="BodyText"/>
       </w:pPr>
       <w:r>
-        <w:t xml:space="preserve">Our observations of</w:t>
-      </w:r>
-      <w:r>
-        <w:t xml:space="preserve"> </w:t>
-      </w:r>
-      <w:r>
-        <w:rPr>
-          <w:i/>
-          <w:iCs/>
-        </w:rPr>
-        <w:t xml:space="preserve">H. platycephalus</w:t>
-      </w:r>
-      <w:r>
-        <w:t xml:space="preserve"> </w:t>
-      </w:r>
-      <w:r>
-        <w:t xml:space="preserve">indicate that, in addition to the known association of</w:t>
-      </w:r>
-      <w:r>
-        <w:t xml:space="preserve"> </w:t>
-      </w:r>
-      <w:r>
-        <w:rPr>
-          <w:i/>
-          <w:iCs/>
-        </w:rPr>
-        <w:t xml:space="preserve">H. platycephalus</w:t>
-      </w:r>
-      <w:r>
-        <w:t xml:space="preserve"> </w:t>
-      </w:r>
-      <w:r>
-        <w:t xml:space="preserve">with upland habitats in the Sierra Nevada, the species also utilizes lake shore habitats and even underwater littoral habitats of lakes.</w:t>
-      </w:r>
-      <w:r>
-        <w:t xml:space="preserve"> </w:t>
-      </w:r>
-      <w:r>
-        <w:t xml:space="preserve">The unusually high abundance of</w:t>
-      </w:r>
-      <w:r>
-        <w:t xml:space="preserve"> </w:t>
-      </w:r>
-      <w:r>
-        <w:rPr>
-          <w:i/>
-          <w:iCs/>
-        </w:rPr>
-        <w:t xml:space="preserve">H. platycephalus</w:t>
-      </w:r>
-      <w:r>
-        <w:t xml:space="preserve"> </w:t>
-      </w:r>
-      <w:r>
-        <w:t xml:space="preserve">observed along lake shores during some surveys suggests the importance of these lentic habitats for this poorly-understood species.</w:t>
+        <w:t xml:space="preserve">In Sequoia National Park, on 06 Aug 2011 (2030-2130 h), RK searched for</w:t>
+      </w:r>
+      <w:r>
+        <w:t xml:space="preserve"> </w:t>
+      </w:r>
+      <w:r>
+        <w:rPr>
+          <w:i/>
+          <w:iCs/>
+        </w:rPr>
+        <w:t xml:space="preserve">H. platycephalus</w:t>
+      </w:r>
+      <w:r>
+        <w:t xml:space="preserve"> </w:t>
+      </w:r>
+      <w:r>
+        <w:t xml:space="preserve">in seeps flowing over granite outcrops above and approximately 300 m west of an unnamed lake (lake id = 20279; 36.3582°N, -118.4711°W, WGS 84, 3315 m elev.) located in the headwaters of Coyote Creek.</w:t>
+      </w:r>
+      <w:r>
+        <w:t xml:space="preserve"> </w:t>
+      </w:r>
+      <w:r>
+        <w:t xml:space="preserve">On 07 Aug 2011 (approximately 2100 h), RK searched similar habitat above and approximately 300 m west of an unnamed lake (site id = 20276; 36.3669°N, -118.4883°W, WGS 84, 3298 m elev.) located in the headwaters of Laurel Creek.</w:t>
+      </w:r>
+      <w:r>
+        <w:t xml:space="preserve"> </w:t>
+      </w:r>
+      <w:r>
+        <w:t xml:space="preserve">Coyote and Laurel Creeks are tributaries of the Kern River.</w:t>
+      </w:r>
+      <w:r>
+        <w:t xml:space="preserve"> </w:t>
+      </w:r>
+      <w:r>
+        <w:t xml:space="preserve">Despite the searched sites being 8.1 km and 6.5 km, respectively, southeast of the southernmost known</w:t>
+      </w:r>
+      <w:r>
+        <w:t xml:space="preserve"> </w:t>
+      </w:r>
+      <w:r>
+        <w:rPr>
+          <w:i/>
+          <w:iCs/>
+        </w:rPr>
+        <w:t xml:space="preserve">H. platycephalus</w:t>
+      </w:r>
+      <w:r>
+        <w:t xml:space="preserve"> </w:t>
+      </w:r>
+      <w:r>
+        <w:t xml:space="preserve">locality west of the Sierra Nevada crest (Wake and Papenfuss 2005), 5–10</w:t>
+      </w:r>
+      <w:r>
+        <w:t xml:space="preserve"> </w:t>
+      </w:r>
+      <w:r>
+        <w:rPr>
+          <w:i/>
+          <w:iCs/>
+        </w:rPr>
+        <w:t xml:space="preserve">H. platycephalus</w:t>
+      </w:r>
+      <w:r>
+        <w:t xml:space="preserve"> </w:t>
+      </w:r>
+      <w:r>
+        <w:t xml:space="preserve">were found at each location.</w:t>
+      </w:r>
+      <w:r>
+        <w:t xml:space="preserve"> </w:t>
+      </w:r>
+      <w:r>
+        <w:t xml:space="preserve">The Laurel Creek area was surveyed again in 2024 (by FP and RK) and 2025 (by CS and RK), with a focus on lake 20276.</w:t>
+      </w:r>
+      <w:r>
+        <w:t xml:space="preserve"> </w:t>
+      </w:r>
+      <w:r>
+        <w:t xml:space="preserve">20276 has a surface area of 1.7 ha and a maximum depth of 12.5 m.</w:t>
+      </w:r>
+      <w:r>
+        <w:t xml:space="preserve"> </w:t>
+      </w:r>
+      <w:r>
+        <w:t xml:space="preserve">During 14–16 July 2024, we conducted one diurnal survey (0910-1210 h) and two nocturnal surveys (2130–2315 h) of the entire shoreline and associated inlet and outlet streams of 20276, and one nocturnal survey of the original bedrock outcrop locality (approximately 2200 h).</w:t>
+      </w:r>
+      <w:r>
+        <w:t xml:space="preserve"> </w:t>
+      </w:r>
+      <w:r>
+        <w:t xml:space="preserve">During the diurnal survey of 20276, no</w:t>
+      </w:r>
+      <w:r>
+        <w:t xml:space="preserve"> </w:t>
+      </w:r>
+      <w:r>
+        <w:rPr>
+          <w:i/>
+          <w:iCs/>
+        </w:rPr>
+        <w:t xml:space="preserve">H. platycephalus</w:t>
+      </w:r>
+      <w:r>
+        <w:t xml:space="preserve"> </w:t>
+      </w:r>
+      <w:r>
+        <w:t xml:space="preserve">were found.</w:t>
+      </w:r>
+      <w:r>
+        <w:t xml:space="preserve"> </w:t>
+      </w:r>
+      <w:r>
+        <w:t xml:space="preserve">During the two nocturnal surveys of 20276, we observed a total of 9</w:t>
+      </w:r>
+      <w:r>
+        <w:t xml:space="preserve"> </w:t>
+      </w:r>
+      <w:r>
+        <w:rPr>
+          <w:i/>
+          <w:iCs/>
+        </w:rPr>
+        <w:t xml:space="preserve">H. platycephalus</w:t>
+      </w:r>
+      <w:r>
+        <w:t xml:space="preserve"> </w:t>
+      </w:r>
+      <w:r>
+        <w:t xml:space="preserve">(2 on 15 July, 7 on 16 July), all on the northeast shore.</w:t>
+      </w:r>
+      <w:r>
+        <w:t xml:space="preserve"> </w:t>
+      </w:r>
+      <w:r>
+        <w:t xml:space="preserve">We found no</w:t>
+      </w:r>
+      <w:r>
+        <w:t xml:space="preserve"> </w:t>
+      </w:r>
+      <w:r>
+        <w:rPr>
+          <w:i/>
+          <w:iCs/>
+        </w:rPr>
+        <w:t xml:space="preserve">H. platycephalus</w:t>
+      </w:r>
+      <w:r>
+        <w:t xml:space="preserve"> </w:t>
+      </w:r>
+      <w:r>
+        <w:t xml:space="preserve">during the nocturnal survey at the original outcrop locality.</w:t>
+      </w:r>
+      <w:r>
+        <w:t xml:space="preserve"> </w:t>
+      </w:r>
+      <w:r>
+        <w:t xml:space="preserve">In 2025, we repeated this survey, conducting one diurnal survey (12 July, 0900–1110 h) and two nocturnal surveys of the entire shoreline of 20276 (12 July, 2130–2345 h; 13 July, 2140–2310 h), and one nocturnal survey of the original outcrop locality (13 July, approximately 2330 h)</w:t>
+      </w:r>
+      <w:r>
+        <w:t xml:space="preserve">.</w:t>
+      </w:r>
+      <w:r>
+        <w:t xml:space="preserve"> </w:t>
+      </w:r>
+      <w:r>
+        <w:t xml:space="preserve">Again, we found no</w:t>
+      </w:r>
+      <w:r>
+        <w:t xml:space="preserve"> </w:t>
+      </w:r>
+      <w:r>
+        <w:rPr>
+          <w:i/>
+          <w:iCs/>
+        </w:rPr>
+        <w:t xml:space="preserve">H. platycephalus</w:t>
+      </w:r>
+      <w:r>
+        <w:t xml:space="preserve"> </w:t>
+      </w:r>
+      <w:r>
+        <w:t xml:space="preserve">during the diurnal survey of 20276 or the nocturnal survey of the original outcrop locality.</w:t>
+      </w:r>
+      <w:r>
+        <w:t xml:space="preserve"> </w:t>
+      </w:r>
+      <w:r>
+        <w:t xml:space="preserve">However, we saw 20-30</w:t>
+      </w:r>
+      <w:r>
+        <w:t xml:space="preserve"> </w:t>
+      </w:r>
+      <w:r>
+        <w:rPr>
+          <w:i/>
+          <w:iCs/>
+        </w:rPr>
+        <w:t xml:space="preserve">H. platycephalus</w:t>
+      </w:r>
+      <w:r>
+        <w:t xml:space="preserve"> </w:t>
+      </w:r>
+      <w:r>
+        <w:t xml:space="preserve">during each of the two nocturnal surveys of 20276, concentrated on the southeast and northeast shorelines.</w:t>
+      </w:r>
+      <w:r>
+        <w:t xml:space="preserve"> </w:t>
+      </w:r>
+      <w:r>
+        <w:t xml:space="preserve">In both years,</w:t>
+      </w:r>
+      <w:r>
+        <w:t xml:space="preserve"> </w:t>
+      </w:r>
+      <w:r>
+        <w:rPr>
+          <w:i/>
+          <w:iCs/>
+        </w:rPr>
+        <w:t xml:space="preserve">H</w:t>
+      </w:r>
+      <w:r>
+        <w:t xml:space="preserve">.</w:t>
+      </w:r>
+      <w:r>
+        <w:t xml:space="preserve"> </w:t>
+      </w:r>
+      <w:r>
+        <w:rPr>
+          <w:i/>
+          <w:iCs/>
+        </w:rPr>
+        <w:t xml:space="preserve">platycephalus</w:t>
+      </w:r>
+      <w:r>
+        <w:t xml:space="preserve"> </w:t>
+      </w:r>
+      <w:r>
+        <w:t xml:space="preserve">were observed on wet rocks and moss on the shore within 0–1 m of the lake.</w:t>
       </w:r>
     </w:p>
     <w:p>
@@ -856,47 +787,121 @@
         <w:pStyle w:val="BodyText"/>
       </w:pPr>
       <w:r>
-        <w:rPr>
-          <w:smallCaps/>
-        </w:rPr>
-        <w:t xml:space="preserve">FIG. 1</w:t>
-      </w:r>
-      <w:r>
-        <w:t xml:space="preserve">.</w:t>
-      </w:r>
-      <w:r>
-        <w:t xml:space="preserve"> </w:t>
-      </w:r>
-      <w:r>
-        <w:t xml:space="preserve">Seven adult</w:t>
-      </w:r>
-      <w:r>
-        <w:t xml:space="preserve"> </w:t>
-      </w:r>
-      <w:r>
-        <w:rPr>
-          <w:i/>
-          <w:iCs/>
-        </w:rPr>
-        <w:t xml:space="preserve">Hydromantes platycephalus</w:t>
-      </w:r>
-      <w:r>
-        <w:t xml:space="preserve"> </w:t>
-      </w:r>
-      <w:r>
-        <w:t xml:space="preserve">observed along the shoreline of lake 70413 in Yosemite National Park, USA during a nocturnal survey on 19 August 2025.</w:t>
-      </w:r>
-      <w:r>
-        <w:t xml:space="preserve"> </w:t>
-      </w:r>
-      <w:r>
-        <w:t xml:space="preserve">Each salamander is indicated with a black arrow.</w:t>
-      </w:r>
-      <w:r>
-        <w:t xml:space="preserve"> </w:t>
-      </w:r>
-      <w:r>
-        <w:t xml:space="preserve">The lake is visible in the immediate foreground.</w:t>
+        <w:t xml:space="preserve">Our observations of</w:t>
+      </w:r>
+      <w:r>
+        <w:t xml:space="preserve"> </w:t>
+      </w:r>
+      <w:r>
+        <w:rPr>
+          <w:i/>
+          <w:iCs/>
+        </w:rPr>
+        <w:t xml:space="preserve">H. platycephalus</w:t>
+      </w:r>
+      <w:r>
+        <w:t xml:space="preserve"> </w:t>
+      </w:r>
+      <w:r>
+        <w:t xml:space="preserve">indicate that, in addition to the known association of</w:t>
+      </w:r>
+      <w:r>
+        <w:t xml:space="preserve"> </w:t>
+      </w:r>
+      <w:r>
+        <w:rPr>
+          <w:i/>
+          <w:iCs/>
+        </w:rPr>
+        <w:t xml:space="preserve">H. platycephalus</w:t>
+      </w:r>
+      <w:r>
+        <w:t xml:space="preserve"> </w:t>
+      </w:r>
+      <w:r>
+        <w:t xml:space="preserve">with upland habitats in the Sierra Nevada, the species also utilizes lake shore habitats and even underwater littoral habitats of lakes.</w:t>
+      </w:r>
+      <w:r>
+        <w:t xml:space="preserve"> </w:t>
+      </w:r>
+      <w:r>
+        <w:t xml:space="preserve">The unusually high abundance of</w:t>
+      </w:r>
+      <w:r>
+        <w:t xml:space="preserve"> </w:t>
+      </w:r>
+      <w:r>
+        <w:rPr>
+          <w:i/>
+          <w:iCs/>
+        </w:rPr>
+        <w:t xml:space="preserve">H. platycephalus</w:t>
+      </w:r>
+      <w:r>
+        <w:t xml:space="preserve"> </w:t>
+      </w:r>
+      <w:r>
+        <w:t xml:space="preserve">we observed along lake shores during some surveys suggests the previously unrecognized importance of these lentic habitats for this poorly-understood species.</w:t>
+      </w:r>
+      <w:r>
+        <w:t xml:space="preserve"> </w:t>
+      </w:r>
+      <w:r>
+        <w:t xml:space="preserve">For</w:t>
+      </w:r>
+      <w:r>
+        <w:t xml:space="preserve"> </w:t>
+      </w:r>
+      <w:r>
+        <w:rPr>
+          <w:i/>
+          <w:iCs/>
+        </w:rPr>
+        <w:t xml:space="preserve">H. platycephalus</w:t>
+      </w:r>
+      <w:r>
+        <w:t xml:space="preserve"> </w:t>
+      </w:r>
+      <w:r>
+        <w:t xml:space="preserve">west of the Sierra Nevada crest, our observations in Sequoia National Park also extend the known range of</w:t>
+      </w:r>
+      <w:r>
+        <w:t xml:space="preserve"> </w:t>
+      </w:r>
+      <w:r>
+        <w:rPr>
+          <w:i/>
+          <w:iCs/>
+        </w:rPr>
+        <w:t xml:space="preserve">H. platycephalus</w:t>
+      </w:r>
+      <w:r>
+        <w:t xml:space="preserve"> </w:t>
+      </w:r>
+      <w:r>
+        <w:t xml:space="preserve">south by 3.9 km.</w:t>
+      </w:r>
+      <w:r>
+        <w:t xml:space="preserve"> </w:t>
+      </w:r>
+      <w:r>
+        <w:t xml:space="preserve">This suggests the need for additional surveys of suitable habitats in this area to better describe the range of</w:t>
+      </w:r>
+      <w:r>
+        <w:t xml:space="preserve"> </w:t>
+      </w:r>
+      <w:r>
+        <w:rPr>
+          <w:i/>
+          <w:iCs/>
+        </w:rPr>
+        <w:t xml:space="preserve">H. platycephalus</w:t>
+      </w:r>
+      <w:r>
+        <w:t xml:space="preserve"> </w:t>
+      </w:r>
+      <w:r>
+        <w:t xml:space="preserve">in the southernmost Sierra Nevada.</w:t>
       </w:r>
     </w:p>
     <w:p>
@@ -904,23 +909,61 @@
         <w:pStyle w:val="BodyText"/>
       </w:pPr>
       <w:r>
-        <w:t xml:space="preserve">PARKER X. LAND (parkerland29@gmail.com), GEORGIA X. LATTIG, and LEONIE M. WALDERICH, Sierra Nevada Aquatic Research Laboratory, University of California, Mammoth Lakes, California 93546, USA &amp; Earth Research Institute, University of California, Santa Barbara, California 93106, USA.</w:t>
-      </w:r>
-      <w:r>
-        <w:t xml:space="preserve"> </w:t>
-      </w:r>
-      <w:r>
-        <w:t xml:space="preserve">JACOB X. STAINES, Affiliation; FOREST X. PERI and ROLAND A. KNAPP (roland.knapp@ucsb.edu), Sierra Nevada Aquatic Research Laboratory, University of California, Mammoth Lakes, California 93546, USA &amp; Earth Research Institute, University of California, Santa Barbara, California 93106, USA.</w:t>
-      </w:r>
-      <w:r>
-        <w:t xml:space="preserve"> </w:t>
-      </w:r>
-      <w:r>
-        <w:rPr>
-          <w:i/>
-          <w:iCs/>
-        </w:rPr>
-        <w:t xml:space="preserve">First cut on author order based solely on Roland’s best guess on relative survey effort by each author. Discuss and finalize. Everyone also needs to add their middle initial, if they want that included in their name.</w:t>
+        <w:rPr>
+          <w:smallCaps/>
+        </w:rPr>
+        <w:t xml:space="preserve">FIG. 1</w:t>
+      </w:r>
+      <w:r>
+        <w:t xml:space="preserve">.</w:t>
+      </w:r>
+      <w:r>
+        <w:t xml:space="preserve"> </w:t>
+      </w:r>
+      <w:r>
+        <w:t xml:space="preserve">Seven adult</w:t>
+      </w:r>
+      <w:r>
+        <w:t xml:space="preserve"> </w:t>
+      </w:r>
+      <w:r>
+        <w:rPr>
+          <w:i/>
+          <w:iCs/>
+        </w:rPr>
+        <w:t xml:space="preserve">Hydromantes platycephalus</w:t>
+      </w:r>
+      <w:r>
+        <w:t xml:space="preserve"> </w:t>
+      </w:r>
+      <w:r>
+        <w:t xml:space="preserve">observed along the shoreline of lake 70413 in Yosemite National Park, USA during a nocturnal survey on 19 August 2025.</w:t>
+      </w:r>
+      <w:r>
+        <w:t xml:space="preserve"> </w:t>
+      </w:r>
+      <w:r>
+        <w:t xml:space="preserve">Each salamander is indicated with a black arrow.</w:t>
+      </w:r>
+      <w:r>
+        <w:t xml:space="preserve"> </w:t>
+      </w:r>
+      <w:r>
+        <w:t xml:space="preserve">The lake is visible in the immediate foreground.</w:t>
+      </w:r>
+    </w:p>
+    <w:p>
+      <w:pPr>
+        <w:pStyle w:val="BodyText"/>
+      </w:pPr>
+      <w:r>
+        <w:t xml:space="preserve">PARKER R. LAND (parkerland29@gmail.com), GEORGIA Q. LATTIG (glattig24@coa.edu), and LEONIE M. WALDERICH, Sierra Nevada Aquatic Research Laboratory, University of California, Mammoth Lakes, California 93546, USA &amp; Earth Research Institute, University of California, Santa Barbara, California 93106, USA.</w:t>
+      </w:r>
+      <w:r>
+        <w:t xml:space="preserve"> </w:t>
+      </w:r>
+      <w:r>
+        <w:t xml:space="preserve">JACOB W. STAINES, Affiliation; FOREST D. PERI and ROLAND A. KNAPP (roland.knapp@ucsb.edu), Sierra Nevada Aquatic Research Laboratory, University of California, Mammoth Lakes, California 93546, USA &amp; Earth Research Institute, University of California, Santa Barbara, California 93106, USA.</w:t>
       </w:r>
     </w:p>
     <w:sectPr/>

</xml_diff>